<commit_message>
docs(tv1): dong bo rang buoc tuoi DATEADD, actual plan benchmark va phan dinh pham vi anh lich su
</commit_message>
<xml_diff>
--- a/Bo_nop_Nhom06/evidence/TV1/TV1_Phan_Bao_Cao.docx
+++ b/Bo_nop_Nhom06/evidence/TV1/TV1_Phan_Bao_Cao.docx
@@ -1562,7 +1562,7 @@
                 <w:i w:val="0"/>
                 <w:sz w:val="19"/>
               </w:rPr>
-              <w:t>Ngày sinh; tham gia kiểm tra độ tuổi lao động</w:t>
+              <w:t>Ngày sinh; tham gia kiểm tra độ tuổi lao động chính xác</w:t>
             </w:r>
           </w:p>
         </w:tc>
@@ -2174,7 +2174,7 @@
                 <w:i w:val="0"/>
                 <w:sz w:val="19"/>
               </w:rPr>
-              <w:t>Ngày bắt đầu làm việc; CHK tuổi: DATEDIFF(YEAR, NgaySinh, NgayVaoLam) &gt;= 18</w:t>
+              <w:t>Ngày vào làm; CHK tuổi: NgaySinh &lt;= DATEADD(YEAR, -18, NgayVaoLam)</w:t>
             </w:r>
           </w:p>
         </w:tc>
@@ -3722,7 +3722,7 @@
           <w:i w:val="0"/>
           <w:sz w:val="21"/>
         </w:rPr>
-        <w:t>Ràng buộc nghiệp vụ quan trọng: CHK_NHANVIEN_DoTuoi được cài đặt chuẩn xác: DATEDIFF(YEAR, NgaySinh, NgayVaoLam) &gt;= 18, bảo đảm nhân viên đủ 18 tuổi tại thời điểm bắt đầu làm việc. CCCD đúng 12 chữ số; SĐT đúng 10 số bắt đầu bằng 0; Email đúng cú pháp.</w:t>
+        <w:t>Ràng buộc nghiệp vụ quan trọng: CHK_NHANVIEN_DoTuoi được cài đặt chuẩn xác theo schema hiện hành: NgaySinh &lt;= DATEADD(YEAR, -18, NgayVaoLam). Công thức này kiểm tra chính xác ngày sinh nhật thực tế (birthday-aware), khắc phục triệt để khiếm khuyết của hàm DATEDIFF (vốn chỉ đếm số lần qua ranh giới năm, dẫn tới việc nhân viên chưa tới ngày sinh nhật trong năm vẫn bị tính là đủ 18 tuổi). Script kiểm thử database/tests/TV1_Age_Boundaries.sql đã kiểm tra toàn diện 9 ca kiểm thử biên (18 thao tác gồm INSERT trực tiếp và Stored Procedure sp_ThemNhanVien), xử lý chuẩn xác các ranh giới trước/đúng/sau ngày sinh nhật và năm nhuận 29/02. Tầng ứng dụng Java sử dụng java.time.Period để kiểm tra đồng bộ. CCCD đúng 12 chữ số; SĐT đúng 10 số bắt đầu bằng 0; Email đúng cú pháp regex.</w:t>
       </w:r>
     </w:p>
     <w:p>
@@ -3953,7 +3953,7 @@
         </w:trPr>
         <w:tc>
           <w:tcPr>
-            <w:tcW w:type="dxa" w:w="2592"/>
+            <w:tcW w:type="dxa" w:w="2880"/>
             <w:shd w:fill="1F4E79"/>
           </w:tcPr>
           <w:p>
@@ -3995,7 +3995,7 @@
         </w:tc>
         <w:tc>
           <w:tcPr>
-            <w:tcW w:type="dxa" w:w="5472"/>
+            <w:tcW w:type="dxa" w:w="5184"/>
             <w:shd w:fill="1F4E79"/>
           </w:tcPr>
           <w:p>
@@ -4018,7 +4018,7 @@
       <w:tr>
         <w:tc>
           <w:tcPr>
-            <w:tcW w:type="dxa" w:w="2592"/>
+            <w:tcW w:type="dxa" w:w="2880"/>
             <w:shd w:fill="FFFFFF"/>
           </w:tcPr>
           <w:p>
@@ -4032,7 +4032,7 @@
                 <w:i w:val="0"/>
                 <w:sz w:val="19"/>
               </w:rPr>
-              <w:t>SQL Integration Test (test_module_nhansu_TV1.sql)</w:t>
+              <w:t>SQL Integration &amp; Biên tuổi (test_module_nhansu_TV1.sql, TV1_Age_Boundaries.sql)</w:t>
             </w:r>
           </w:p>
         </w:tc>
@@ -4053,12 +4053,14 @@
                 <w:sz w:val="19"/>
               </w:rPr>
               <w:t>7/7 PASS</w:t>
+              <w:br/>
+              <w:t>9/9 Ca biên PASS</w:t>
             </w:r>
           </w:p>
         </w:tc>
         <w:tc>
           <w:tcPr>
-            <w:tcW w:type="dxa" w:w="5472"/>
+            <w:tcW w:type="dxa" w:w="5184"/>
             <w:shd w:fill="FFFFFF"/>
           </w:tcPr>
           <w:p>
@@ -4072,7 +4074,7 @@
                 <w:i w:val="0"/>
                 <w:sz w:val="19"/>
               </w:rPr>
-              <w:t>Kiểm tra tạo nhân viên/profile, CHK tuổi &gt;= 18, rollback khi trùng tài khoản, cập nhật ngày vào làm, trigger chặn xóa, hàm tính công, view và index. Dọn dẹp fixture PASS.</w:t>
+              <w:t>Kiểm tra tạo profile, ràng buộc tuổi NgaySinh &lt;= DATEADD(YEAR,-18,NgayVaoLam), 9 ca biên birthday-aware, rollback trùng username, ngày vào làm, trigger chặn xóa, tính công, view và index.</w:t>
             </w:r>
           </w:p>
         </w:tc>
@@ -4080,7 +4082,7 @@
       <w:tr>
         <w:tc>
           <w:tcPr>
-            <w:tcW w:type="dxa" w:w="2592"/>
+            <w:tcW w:type="dxa" w:w="2880"/>
             <w:shd w:fill="F2F4F7"/>
           </w:tcPr>
           <w:p>
@@ -4120,7 +4122,7 @@
         </w:tc>
         <w:tc>
           <w:tcPr>
-            <w:tcW w:type="dxa" w:w="5472"/>
+            <w:tcW w:type="dxa" w:w="5184"/>
             <w:shd w:fill="F2F4F7"/>
           </w:tcPr>
           <w:p>
@@ -4134,7 +4136,7 @@
                 <w:i w:val="0"/>
                 <w:sz w:val="19"/>
               </w:rPr>
-              <w:t>Đo lường trên bảng tạm #NhanVienBenchmark 5.000 dòng. Clustered Scan: 75 logical reads -&gt; Index Seek covering: 10 logical reads. Triệt tiêu 100% Key Lookup. Cùng trả về 500 dòng.</w:t>
+              <w:t>Đo lường trên fixture #NhanVienBenchmark 5.000 dòng độc lập. Clustered Scan: 75 logical reads -&gt; Index Seek covering: 10 logical reads. Triệt tiêu 100% Key Lookup. Cùng trả về 500 dòng. Bằng chứng kỹ thuật chính thức lưu tại log và actual plan.</w:t>
             </w:r>
           </w:p>
         </w:tc>
@@ -4142,7 +4144,7 @@
       <w:tr>
         <w:tc>
           <w:tcPr>
-            <w:tcW w:type="dxa" w:w="2592"/>
+            <w:tcW w:type="dxa" w:w="2880"/>
             <w:shd w:fill="FFFFFF"/>
           </w:tcPr>
           <w:p>
@@ -4182,7 +4184,7 @@
         </w:tc>
         <w:tc>
           <w:tcPr>
-            <w:tcW w:type="dxa" w:w="5472"/>
+            <w:tcW w:type="dxa" w:w="5184"/>
             <w:shd w:fill="FFFFFF"/>
           </w:tcPr>
           <w:p>
@@ -4204,7 +4206,7 @@
       <w:tr>
         <w:tc>
           <w:tcPr>
-            <w:tcW w:type="dxa" w:w="2592"/>
+            <w:tcW w:type="dxa" w:w="2880"/>
             <w:shd w:fill="F2F4F7"/>
           </w:tcPr>
           <w:p>
@@ -4244,7 +4246,7 @@
         </w:tc>
         <w:tc>
           <w:tcPr>
-            <w:tcW w:type="dxa" w:w="5472"/>
+            <w:tcW w:type="dxa" w:w="5184"/>
             <w:shd w:fill="F2F4F7"/>
           </w:tcPr>
           <w:p>
@@ -4264,6 +4266,20 @@
         </w:tc>
       </w:tr>
     </w:tbl>
+    <w:p>
+      <w:pPr>
+        <w:spacing w:before="0" w:after="60" w:line="276" w:lineRule="auto"/>
+      </w:pPr>
+      <w:r>
+        <w:rPr>
+          <w:rFonts w:ascii="Times New Roman" w:hAnsi="Times New Roman"/>
+          <w:b w:val="0"/>
+          <w:i w:val="0"/>
+          <w:sz w:val="21"/>
+        </w:rPr>
+        <w:t>Bằng chứng kỹ thuật chính thức cho kết quả benchmark 75 -&gt; 10 logical reads là file log thực thi benchmark_test_benchmark_index_TV1.log và file Actual Execution Plan XML TV1_Benchmark_ActualPlan.sqlplan trích xuất trực tiếp từ Microsoft SQL Server 2025. Hai ảnh chụp màn hình Hình 6 và Hình 7 dưới đây là ảnh chụp màn hình lịch sử (ngày 30/09/2026 trên bảng NHANVIEN mẫu ban đầu 4 dòng, 2 reads) ghi nhận giao diện SSMS khi phân biệt Clustered Scan vs Index Seek trong giai đoạn phát triển ban đầu, được lưu giữ để minh họa trực quan giao diện công cụ, không dùng làm bằng chứng số liệu cho kết quả đo lường 5.000 dòng.</w:t>
+      </w:r>
+    </w:p>
     <w:p>
       <w:pPr>
         <w:spacing w:before="120" w:after="40"/>
@@ -4317,7 +4333,7 @@
           <w:color w:val="505050"/>
           <w:sz w:val="19"/>
         </w:rPr>
-        <w:t>Hình 6: So sánh Execution Plan thực tế giữa Clustered Index Scan (74%) và Non-Clustered Index Seek (26%)</w:t>
+        <w:t>Hình 6: Minh họa giao diện SSMS lịch sử (lượt thử nghiệm ban đầu): Phân biệt Clustered Index Scan (74%) và Index Seek (26%)</w:t>
       </w:r>
     </w:p>
     <w:p>
@@ -4373,7 +4389,7 @@
           <w:color w:val="505050"/>
           <w:sz w:val="19"/>
         </w:rPr>
-        <w:t>Hình 7: Minh chứng Statistics IO từ SQL Server: Logical Reads giảm từ 75 xuống 10 (giảm 86.67%)</w:t>
+        <w:t>Hình 7: Minh họa giao diện Statistics IO lịch sử trong SSMS. (Lưu ý: Số liệu benchmark chính thức 75 -&gt; 10 reads được lưu tại benchmark_test_benchmark_index_TV1.log và TV1_Benchmark_ActualPlan.sqlplan)</w:t>
       </w:r>
     </w:p>
     <w:p>
@@ -4387,7 +4403,7 @@
           <w:i w:val="0"/>
           <w:sz w:val="21"/>
         </w:rPr>
-        <w:t>Tất cả 8 ảnh chụp màn hình (ERD 10 bảng, Execution Plan, Statistics IO, Trigger, Rollback, Danh mục, Hồ sơ nhân viên) và 2 file log kết quả (test_module_nhansu_TV1.log, benchmark_test_benchmark_index_TV1.log) đã được đóng gói trực tiếp trong thư mục Bo_nop_Nhom06/evidence/TV1/Minh_chung/ và được kiểm tra tính toàn vẹn qua mã băm độc lập SHA256_TV1.csv.</w:t>
+        <w:t>Tất cả 8 ảnh chụp màn hình, file Actual Plan TV1_Benchmark_ActualPlan.sqlplan và 2 file log kết quả (test_module_nhansu_TV1.log, benchmark_test_benchmark_index_TV1.log) đã được đóng gói trực tiếp trong thư mục Bo_nop_Nhom06/evidence/TV1/Minh_chung/ và được kiểm tra tính toàn vẹn qua mã băm độc lập SHA256_TV1.csv.</w:t>
       </w:r>
     </w:p>
     <w:sectPr>

</xml_diff>